<commit_message>
updated manual to specify the First and Last Day of Fire are zero-based.
</commit_message>
<xml_diff>
--- a/docs/LANDIS-II Climate Library v5.0 User Guide.docx
+++ b/docs/LANDIS-II Climate Library v5.0 User Guide.docx
@@ -160,7 +160,7 @@
         <w:rPr>
           <w:noProof/>
         </w:rPr>
-        <w:t>February 18, 2026</w:t>
+        <w:t>July 15, 2026</w:t>
       </w:r>
       <w:r>
         <w:rPr>
@@ -5929,6 +5929,7 @@
       <w:bookmarkStart w:id="35" w:name="_Toc173946541"/>
       <w:proofErr w:type="spellStart"/>
       <w:r>
+        <w:lastRenderedPageBreak/>
         <w:t>FirstDayFire</w:t>
       </w:r>
       <w:bookmarkEnd w:id="35"/>
@@ -5937,9 +5938,23 @@
     <w:p>
       <w:pPr>
         <w:pStyle w:val="textbody"/>
+        <w:rPr>
+          <w:b/>
+          <w:bCs/>
+        </w:rPr>
       </w:pPr>
       <w:r>
         <w:t>Julian day of the earliest possible fire.</w:t>
+      </w:r>
+      <w:r>
+        <w:t xml:space="preserve"> </w:t>
+      </w:r>
+      <w:r>
+        <w:rPr>
+          <w:b/>
+          <w:bCs/>
+        </w:rPr>
+        <w:t xml:space="preserve">This is indexed by zero so the first day of the year is 0. </w:t>
       </w:r>
     </w:p>
     <w:p>
@@ -5954,7 +5969,6 @@
       <w:bookmarkStart w:id="36" w:name="_Toc173946542"/>
       <w:proofErr w:type="spellStart"/>
       <w:r>
-        <w:lastRenderedPageBreak/>
         <w:t>LastDayFire</w:t>
       </w:r>
       <w:bookmarkEnd w:id="36"/>
@@ -5963,9 +5977,39 @@
     <w:p>
       <w:pPr>
         <w:pStyle w:val="textbody"/>
+        <w:rPr>
+          <w:b/>
+          <w:bCs/>
+        </w:rPr>
       </w:pPr>
       <w:r>
         <w:t>Julian day of the latest possible fire.</w:t>
+      </w:r>
+      <w:r>
+        <w:t xml:space="preserve"> </w:t>
+      </w:r>
+      <w:r>
+        <w:rPr>
+          <w:b/>
+          <w:bCs/>
+        </w:rPr>
+        <w:t xml:space="preserve">This is also indexed by </w:t>
+      </w:r>
+      <w:proofErr w:type="gramStart"/>
+      <w:r>
+        <w:rPr>
+          <w:b/>
+          <w:bCs/>
+        </w:rPr>
+        <w:t>zero</w:t>
+      </w:r>
+      <w:proofErr w:type="gramEnd"/>
+      <w:r>
+        <w:rPr>
+          <w:b/>
+          <w:bCs/>
+        </w:rPr>
+        <w:t xml:space="preserve"> so the last day of the year is 364. </w:t>
       </w:r>
     </w:p>
     <w:p>

</xml_diff>